<commit_message>
Fix location seeding and paths for Render deployment
</commit_message>
<xml_diff>
--- a/Hosting Intro.docx
+++ b/Hosting Intro.docx
@@ -142,7 +142,7 @@
     <w:p>
       <w:r>
         <w:pict w14:anchorId="745E5809">
-          <v:rect id="_x0000_i1055" style="width:403.05pt;height:.75pt" o:hrpct="0" o:hralign="center" o:hrstd="t" o:hr="t" fillcolor="#a0a0a0" stroked="f"/>
+          <v:rect id="_x0000_i1025" style="width:403.05pt;height:.75pt" o:hrpct="0" o:hralign="center" o:hrstd="t" o:hr="t" fillcolor="#a0a0a0" stroked="f"/>
         </w:pict>
       </w:r>
     </w:p>
@@ -849,7 +849,7 @@
     <w:p>
       <w:r>
         <w:pict w14:anchorId="626439CB">
-          <v:rect id="_x0000_i1056" style="width:403.05pt;height:.75pt" o:hrpct="0" o:hralign="center" o:hrstd="t" o:hr="t" fillcolor="#a0a0a0" stroked="f"/>
+          <v:rect id="_x0000_i1026" style="width:403.05pt;height:.75pt" o:hrpct="0" o:hralign="center" o:hrstd="t" o:hr="t" fillcolor="#a0a0a0" stroked="f"/>
         </w:pict>
       </w:r>
     </w:p>
@@ -1180,7 +1180,7 @@
     <w:p>
       <w:r>
         <w:pict w14:anchorId="3A0A0992">
-          <v:rect id="_x0000_i1057" style="width:403.05pt;height:.75pt" o:hrpct="0" o:hralign="center" o:hrstd="t" o:hr="t" fillcolor="#a0a0a0" stroked="f"/>
+          <v:rect id="_x0000_i1027" style="width:403.05pt;height:.75pt" o:hrpct="0" o:hralign="center" o:hrstd="t" o:hr="t" fillcolor="#a0a0a0" stroked="f"/>
         </w:pict>
       </w:r>
     </w:p>
@@ -1670,7 +1670,7 @@
     <w:p>
       <w:r>
         <w:pict w14:anchorId="2E1E044D">
-          <v:rect id="_x0000_i1058" style="width:403.05pt;height:.75pt" o:hrpct="0" o:hralign="center" o:hrstd="t" o:hr="t" fillcolor="#a0a0a0" stroked="f"/>
+          <v:rect id="_x0000_i1028" style="width:403.05pt;height:.75pt" o:hrpct="0" o:hralign="center" o:hrstd="t" o:hr="t" fillcolor="#a0a0a0" stroked="f"/>
         </w:pict>
       </w:r>
     </w:p>
@@ -2053,7 +2053,7 @@
     <w:p>
       <w:r>
         <w:pict w14:anchorId="5097C4C7">
-          <v:rect id="_x0000_i1059" style="width:403.05pt;height:.75pt" o:hrpct="0" o:hralign="center" o:hrstd="t" o:hr="t" fillcolor="#a0a0a0" stroked="f"/>
+          <v:rect id="_x0000_i1029" style="width:403.05pt;height:.75pt" o:hrpct="0" o:hralign="center" o:hrstd="t" o:hr="t" fillcolor="#a0a0a0" stroked="f"/>
         </w:pict>
       </w:r>
     </w:p>
@@ -2162,6 +2162,338 @@
           <w:cs/>
         </w:rPr>
         <w:t>ជូនបានភ្លាមៗ!</w:t>
+      </w:r>
+    </w:p>
+    <w:p/>
+    <w:p/>
+    <w:p>
+      <w:r>
+        <w:t>1. </w:t>
+      </w:r>
+      <w:proofErr w:type="spellStart"/>
+      <w:r>
+        <w:fldChar w:fldCharType="begin"/>
+      </w:r>
+      <w:r>
+        <w:instrText>HYPERLINK "https://neon.tech/"</w:instrText>
+      </w:r>
+      <w:r>
+        <w:fldChar w:fldCharType="separate"/>
+      </w:r>
+      <w:r>
+        <w:rPr>
+          <w:rStyle w:val="Hyperlink"/>
+        </w:rPr>
+        <w:t>Neon.tech</w:t>
+      </w:r>
+      <w:proofErr w:type="spellEnd"/>
+      <w:r>
+        <w:fldChar w:fldCharType="end"/>
+      </w:r>
+      <w:r>
+        <w:t> (Recommended — Free Forever)</w:t>
+      </w:r>
+    </w:p>
+    <w:p>
+      <w:pPr>
+        <w:numPr>
+          <w:ilvl w:val="0"/>
+          <w:numId w:val="5"/>
+        </w:numPr>
+      </w:pPr>
+      <w:r>
+        <w:rPr>
+          <w:b/>
+          <w:bCs/>
+        </w:rPr>
+        <w:t>Cost</w:t>
+      </w:r>
+      <w:r>
+        <w:t>: $0 / Free Forever (0.5 GB storage — plenty for thousands of students and records).</w:t>
+      </w:r>
+    </w:p>
+    <w:p>
+      <w:pPr>
+        <w:numPr>
+          <w:ilvl w:val="0"/>
+          <w:numId w:val="5"/>
+        </w:numPr>
+      </w:pPr>
+      <w:r>
+        <w:rPr>
+          <w:b/>
+          <w:bCs/>
+        </w:rPr>
+        <w:t>Setup</w:t>
+      </w:r>
+      <w:r>
+        <w:t>:</w:t>
+      </w:r>
+    </w:p>
+    <w:p>
+      <w:pPr>
+        <w:numPr>
+          <w:ilvl w:val="1"/>
+          <w:numId w:val="5"/>
+        </w:numPr>
+      </w:pPr>
+      <w:r>
+        <w:t>Go to </w:t>
+      </w:r>
+      <w:proofErr w:type="spellStart"/>
+      <w:r>
+        <w:rPr>
+          <w:b/>
+          <w:bCs/>
+        </w:rPr>
+        <w:fldChar w:fldCharType="begin"/>
+      </w:r>
+      <w:r>
+        <w:rPr>
+          <w:b/>
+          <w:bCs/>
+        </w:rPr>
+        <w:instrText>HYPERLINK "https://neon.tech/"</w:instrText>
+      </w:r>
+      <w:r>
+        <w:rPr>
+          <w:b/>
+          <w:bCs/>
+        </w:rPr>
+      </w:r>
+      <w:r>
+        <w:rPr>
+          <w:b/>
+          <w:bCs/>
+        </w:rPr>
+        <w:fldChar w:fldCharType="separate"/>
+      </w:r>
+      <w:proofErr w:type="gramStart"/>
+      <w:r>
+        <w:rPr>
+          <w:rStyle w:val="Hyperlink"/>
+          <w:b/>
+          <w:bCs/>
+        </w:rPr>
+        <w:t>neon.tech</w:t>
+      </w:r>
+      <w:proofErr w:type="spellEnd"/>
+      <w:proofErr w:type="gramEnd"/>
+      <w:r>
+        <w:fldChar w:fldCharType="end"/>
+      </w:r>
+      <w:r>
+        <w:t> and sign up with GitHub.</w:t>
+      </w:r>
+    </w:p>
+    <w:p>
+      <w:pPr>
+        <w:numPr>
+          <w:ilvl w:val="1"/>
+          <w:numId w:val="5"/>
+        </w:numPr>
+      </w:pPr>
+      <w:r>
+        <w:t>Click </w:t>
+      </w:r>
+      <w:r>
+        <w:rPr>
+          <w:b/>
+          <w:bCs/>
+        </w:rPr>
+        <w:t>Create Project</w:t>
+      </w:r>
+      <w:r>
+        <w:t> (choose Region: </w:t>
+      </w:r>
+      <w:r>
+        <w:rPr>
+          <w:i/>
+          <w:iCs/>
+        </w:rPr>
+        <w:t>Singapore / Asia</w:t>
+      </w:r>
+      <w:r>
+        <w:t>).</w:t>
+      </w:r>
+    </w:p>
+    <w:p>
+      <w:pPr>
+        <w:numPr>
+          <w:ilvl w:val="1"/>
+          <w:numId w:val="5"/>
+        </w:numPr>
+      </w:pPr>
+      <w:r>
+        <w:t>Copy the </w:t>
+      </w:r>
+      <w:r>
+        <w:rPr>
+          <w:b/>
+          <w:bCs/>
+        </w:rPr>
+        <w:t>Connection String / Database URL</w:t>
+      </w:r>
+      <w:r>
+        <w:t> (e.g. </w:t>
+      </w:r>
+      <w:proofErr w:type="gramStart"/>
+      <w:r>
+        <w:t>postgresql://alex:...</w:t>
+      </w:r>
+      <w:proofErr w:type="gramEnd"/>
+      <w:r>
+        <w:t>@</w:t>
+      </w:r>
+      <w:proofErr w:type="gramStart"/>
+      <w:r>
+        <w:t>ep-cool-fog-123.ap-southeast-1.aws.neon.tech</w:t>
+      </w:r>
+      <w:proofErr w:type="gramEnd"/>
+      <w:r>
+        <w:t>/neondb?sslmode=require).</w:t>
+      </w:r>
+    </w:p>
+    <w:p>
+      <w:pPr>
+        <w:numPr>
+          <w:ilvl w:val="1"/>
+          <w:numId w:val="5"/>
+        </w:numPr>
+      </w:pPr>
+      <w:r>
+        <w:t>Paste that into your DATABASE_URL in </w:t>
+      </w:r>
+      <w:r>
+        <w:rPr>
+          <w:b/>
+          <w:bCs/>
+        </w:rPr>
+        <w:t xml:space="preserve">Render </w:t>
+      </w:r>
+      <w:r>
+        <w:rPr>
+          <w:rFonts w:ascii="Arial Unicode MS" w:eastAsia="Arial Unicode MS" w:hAnsi="Arial Unicode MS" w:cs="Arial Unicode MS" w:hint="eastAsia"/>
+          <w:b/>
+          <w:bCs/>
+        </w:rPr>
+        <w:t>➔</w:t>
+      </w:r>
+      <w:r>
+        <w:rPr>
+          <w:b/>
+          <w:bCs/>
+        </w:rPr>
+        <w:t xml:space="preserve"> Environment</w:t>
+      </w:r>
+      <w:r>
+        <w:t>.</w:t>
+      </w:r>
+    </w:p>
+    <w:p>
+      <w:pPr>
+        <w:numPr>
+          <w:ilvl w:val="1"/>
+          <w:numId w:val="5"/>
+        </w:numPr>
+      </w:pPr>
+      <w:r>
+        <w:t>It will </w:t>
+      </w:r>
+      <w:r>
+        <w:rPr>
+          <w:b/>
+          <w:bCs/>
+        </w:rPr>
+        <w:t>never expire</w:t>
+      </w:r>
+      <w:r>
+        <w:t>!</w:t>
+      </w:r>
+    </w:p>
+    <w:p>
+      <w:r>
+        <w:t>2. </w:t>
+      </w:r>
+      <w:hyperlink r:id="rId8" w:history="1">
+        <w:r>
+          <w:rPr>
+            <w:rStyle w:val="Hyperlink"/>
+          </w:rPr>
+          <w:t>Supabase.com</w:t>
+        </w:r>
+      </w:hyperlink>
+      <w:r>
+        <w:t> (Free Forever)</w:t>
+      </w:r>
+    </w:p>
+    <w:p>
+      <w:pPr>
+        <w:numPr>
+          <w:ilvl w:val="0"/>
+          <w:numId w:val="6"/>
+        </w:numPr>
+      </w:pPr>
+      <w:r>
+        <w:rPr>
+          <w:b/>
+          <w:bCs/>
+        </w:rPr>
+        <w:t>Cost</w:t>
+      </w:r>
+      <w:r>
+        <w:t>: $0 / Free (500 MB PostgreSQL database).</w:t>
+      </w:r>
+    </w:p>
+    <w:p>
+      <w:pPr>
+        <w:numPr>
+          <w:ilvl w:val="0"/>
+          <w:numId w:val="6"/>
+        </w:numPr>
+      </w:pPr>
+      <w:r>
+        <w:lastRenderedPageBreak/>
+        <w:t>Gives you a PostgreSQL connection URI to paste into DATABASE_URL.</w:t>
+      </w:r>
+    </w:p>
+    <w:p>
+      <w:r>
+        <w:pict w14:anchorId="0E8B80B6">
+          <v:rect id="_x0000_i1036" style="width:403.05pt;height:.75pt" o:hrpct="0" o:hralign="center" o:hrstd="t" o:hr="t" fillcolor="#a0a0a0" stroked="f"/>
+        </w:pict>
+      </w:r>
+    </w:p>
+    <w:p>
+      <w:r>
+        <w:t>Summary</w:t>
+      </w:r>
+    </w:p>
+    <w:p>
+      <w:r>
+        <w:t>For now, your current Render database is </w:t>
+      </w:r>
+      <w:r>
+        <w:rPr>
+          <w:b/>
+          <w:bCs/>
+        </w:rPr>
+        <w:t>100% active and working for the next 30 days</w:t>
+      </w:r>
+      <w:r>
+        <w:t>. When you are ready for a permanent solution, you can simply plug in a free connection URL from </w:t>
+      </w:r>
+      <w:proofErr w:type="spellStart"/>
+      <w:r>
+        <w:rPr>
+          <w:b/>
+          <w:bCs/>
+        </w:rPr>
+        <w:t>Neon.tech</w:t>
+      </w:r>
+      <w:proofErr w:type="spellEnd"/>
+      <w:r>
+        <w:t> into your Render environment variables anytime!</w:t>
       </w:r>
     </w:p>
     <w:p/>
@@ -2625,6 +2957,155 @@
     </w:lvl>
   </w:abstractNum>
   <w:abstractNum w:abstractNumId="3" w15:restartNumberingAfterBreak="0">
+    <w:nsid w:val="652C1C2D"/>
+    <w:multiLevelType w:val="multilevel"/>
+    <w:tmpl w:val="55C496A6"/>
+    <w:lvl w:ilvl="0">
+      <w:start w:val="1"/>
+      <w:numFmt w:val="bullet"/>
+      <w:lvlText w:val=""/>
+      <w:lvlJc w:val="left"/>
+      <w:pPr>
+        <w:tabs>
+          <w:tab w:val="num" w:pos="720"/>
+        </w:tabs>
+        <w:ind w:left="720" w:hanging="360"/>
+      </w:pPr>
+      <w:rPr>
+        <w:rFonts w:ascii="Symbol" w:hAnsi="Symbol" w:hint="default"/>
+        <w:sz w:val="20"/>
+      </w:rPr>
+    </w:lvl>
+    <w:lvl w:ilvl="1" w:tentative="1">
+      <w:start w:val="1"/>
+      <w:numFmt w:val="bullet"/>
+      <w:lvlText w:val=""/>
+      <w:lvlJc w:val="left"/>
+      <w:pPr>
+        <w:tabs>
+          <w:tab w:val="num" w:pos="1440"/>
+        </w:tabs>
+        <w:ind w:left="1440" w:hanging="360"/>
+      </w:pPr>
+      <w:rPr>
+        <w:rFonts w:ascii="Symbol" w:hAnsi="Symbol" w:hint="default"/>
+        <w:sz w:val="20"/>
+      </w:rPr>
+    </w:lvl>
+    <w:lvl w:ilvl="2" w:tentative="1">
+      <w:start w:val="1"/>
+      <w:numFmt w:val="bullet"/>
+      <w:lvlText w:val=""/>
+      <w:lvlJc w:val="left"/>
+      <w:pPr>
+        <w:tabs>
+          <w:tab w:val="num" w:pos="2160"/>
+        </w:tabs>
+        <w:ind w:left="2160" w:hanging="360"/>
+      </w:pPr>
+      <w:rPr>
+        <w:rFonts w:ascii="Symbol" w:hAnsi="Symbol" w:hint="default"/>
+        <w:sz w:val="20"/>
+      </w:rPr>
+    </w:lvl>
+    <w:lvl w:ilvl="3" w:tentative="1">
+      <w:start w:val="1"/>
+      <w:numFmt w:val="bullet"/>
+      <w:lvlText w:val=""/>
+      <w:lvlJc w:val="left"/>
+      <w:pPr>
+        <w:tabs>
+          <w:tab w:val="num" w:pos="2880"/>
+        </w:tabs>
+        <w:ind w:left="2880" w:hanging="360"/>
+      </w:pPr>
+      <w:rPr>
+        <w:rFonts w:ascii="Symbol" w:hAnsi="Symbol" w:hint="default"/>
+        <w:sz w:val="20"/>
+      </w:rPr>
+    </w:lvl>
+    <w:lvl w:ilvl="4" w:tentative="1">
+      <w:start w:val="1"/>
+      <w:numFmt w:val="bullet"/>
+      <w:lvlText w:val=""/>
+      <w:lvlJc w:val="left"/>
+      <w:pPr>
+        <w:tabs>
+          <w:tab w:val="num" w:pos="3600"/>
+        </w:tabs>
+        <w:ind w:left="3600" w:hanging="360"/>
+      </w:pPr>
+      <w:rPr>
+        <w:rFonts w:ascii="Symbol" w:hAnsi="Symbol" w:hint="default"/>
+        <w:sz w:val="20"/>
+      </w:rPr>
+    </w:lvl>
+    <w:lvl w:ilvl="5" w:tentative="1">
+      <w:start w:val="1"/>
+      <w:numFmt w:val="bullet"/>
+      <w:lvlText w:val=""/>
+      <w:lvlJc w:val="left"/>
+      <w:pPr>
+        <w:tabs>
+          <w:tab w:val="num" w:pos="4320"/>
+        </w:tabs>
+        <w:ind w:left="4320" w:hanging="360"/>
+      </w:pPr>
+      <w:rPr>
+        <w:rFonts w:ascii="Symbol" w:hAnsi="Symbol" w:hint="default"/>
+        <w:sz w:val="20"/>
+      </w:rPr>
+    </w:lvl>
+    <w:lvl w:ilvl="6" w:tentative="1">
+      <w:start w:val="1"/>
+      <w:numFmt w:val="bullet"/>
+      <w:lvlText w:val=""/>
+      <w:lvlJc w:val="left"/>
+      <w:pPr>
+        <w:tabs>
+          <w:tab w:val="num" w:pos="5040"/>
+        </w:tabs>
+        <w:ind w:left="5040" w:hanging="360"/>
+      </w:pPr>
+      <w:rPr>
+        <w:rFonts w:ascii="Symbol" w:hAnsi="Symbol" w:hint="default"/>
+        <w:sz w:val="20"/>
+      </w:rPr>
+    </w:lvl>
+    <w:lvl w:ilvl="7" w:tentative="1">
+      <w:start w:val="1"/>
+      <w:numFmt w:val="bullet"/>
+      <w:lvlText w:val=""/>
+      <w:lvlJc w:val="left"/>
+      <w:pPr>
+        <w:tabs>
+          <w:tab w:val="num" w:pos="5760"/>
+        </w:tabs>
+        <w:ind w:left="5760" w:hanging="360"/>
+      </w:pPr>
+      <w:rPr>
+        <w:rFonts w:ascii="Symbol" w:hAnsi="Symbol" w:hint="default"/>
+        <w:sz w:val="20"/>
+      </w:rPr>
+    </w:lvl>
+    <w:lvl w:ilvl="8" w:tentative="1">
+      <w:start w:val="1"/>
+      <w:numFmt w:val="bullet"/>
+      <w:lvlText w:val=""/>
+      <w:lvlJc w:val="left"/>
+      <w:pPr>
+        <w:tabs>
+          <w:tab w:val="num" w:pos="6480"/>
+        </w:tabs>
+        <w:ind w:left="6480" w:hanging="360"/>
+      </w:pPr>
+      <w:rPr>
+        <w:rFonts w:ascii="Symbol" w:hAnsi="Symbol" w:hint="default"/>
+        <w:sz w:val="20"/>
+      </w:rPr>
+    </w:lvl>
+  </w:abstractNum>
+  <w:abstractNum w:abstractNumId="4" w15:restartNumberingAfterBreak="0">
     <w:nsid w:val="6F876AA9"/>
     <w:multiLevelType w:val="multilevel"/>
     <w:tmpl w:val="3BCA0FD8"/>
@@ -2735,6 +3216,151 @@
         </w:tabs>
         <w:ind w:left="6480" w:hanging="360"/>
       </w:pPr>
+    </w:lvl>
+  </w:abstractNum>
+  <w:abstractNum w:abstractNumId="5" w15:restartNumberingAfterBreak="0">
+    <w:nsid w:val="75A75FB5"/>
+    <w:multiLevelType w:val="multilevel"/>
+    <w:tmpl w:val="F2CAC2DC"/>
+    <w:lvl w:ilvl="0">
+      <w:start w:val="1"/>
+      <w:numFmt w:val="bullet"/>
+      <w:lvlText w:val=""/>
+      <w:lvlJc w:val="left"/>
+      <w:pPr>
+        <w:tabs>
+          <w:tab w:val="num" w:pos="720"/>
+        </w:tabs>
+        <w:ind w:left="720" w:hanging="360"/>
+      </w:pPr>
+      <w:rPr>
+        <w:rFonts w:ascii="Symbol" w:hAnsi="Symbol" w:hint="default"/>
+        <w:sz w:val="20"/>
+      </w:rPr>
+    </w:lvl>
+    <w:lvl w:ilvl="1">
+      <w:start w:val="1"/>
+      <w:numFmt w:val="decimal"/>
+      <w:lvlText w:val="%2."/>
+      <w:lvlJc w:val="left"/>
+      <w:pPr>
+        <w:tabs>
+          <w:tab w:val="num" w:pos="1440"/>
+        </w:tabs>
+        <w:ind w:left="1440" w:hanging="360"/>
+      </w:pPr>
+    </w:lvl>
+    <w:lvl w:ilvl="2" w:tentative="1">
+      <w:start w:val="1"/>
+      <w:numFmt w:val="bullet"/>
+      <w:lvlText w:val=""/>
+      <w:lvlJc w:val="left"/>
+      <w:pPr>
+        <w:tabs>
+          <w:tab w:val="num" w:pos="2160"/>
+        </w:tabs>
+        <w:ind w:left="2160" w:hanging="360"/>
+      </w:pPr>
+      <w:rPr>
+        <w:rFonts w:ascii="Symbol" w:hAnsi="Symbol" w:hint="default"/>
+        <w:sz w:val="20"/>
+      </w:rPr>
+    </w:lvl>
+    <w:lvl w:ilvl="3" w:tentative="1">
+      <w:start w:val="1"/>
+      <w:numFmt w:val="bullet"/>
+      <w:lvlText w:val=""/>
+      <w:lvlJc w:val="left"/>
+      <w:pPr>
+        <w:tabs>
+          <w:tab w:val="num" w:pos="2880"/>
+        </w:tabs>
+        <w:ind w:left="2880" w:hanging="360"/>
+      </w:pPr>
+      <w:rPr>
+        <w:rFonts w:ascii="Symbol" w:hAnsi="Symbol" w:hint="default"/>
+        <w:sz w:val="20"/>
+      </w:rPr>
+    </w:lvl>
+    <w:lvl w:ilvl="4" w:tentative="1">
+      <w:start w:val="1"/>
+      <w:numFmt w:val="bullet"/>
+      <w:lvlText w:val=""/>
+      <w:lvlJc w:val="left"/>
+      <w:pPr>
+        <w:tabs>
+          <w:tab w:val="num" w:pos="3600"/>
+        </w:tabs>
+        <w:ind w:left="3600" w:hanging="360"/>
+      </w:pPr>
+      <w:rPr>
+        <w:rFonts w:ascii="Symbol" w:hAnsi="Symbol" w:hint="default"/>
+        <w:sz w:val="20"/>
+      </w:rPr>
+    </w:lvl>
+    <w:lvl w:ilvl="5" w:tentative="1">
+      <w:start w:val="1"/>
+      <w:numFmt w:val="bullet"/>
+      <w:lvlText w:val=""/>
+      <w:lvlJc w:val="left"/>
+      <w:pPr>
+        <w:tabs>
+          <w:tab w:val="num" w:pos="4320"/>
+        </w:tabs>
+        <w:ind w:left="4320" w:hanging="360"/>
+      </w:pPr>
+      <w:rPr>
+        <w:rFonts w:ascii="Symbol" w:hAnsi="Symbol" w:hint="default"/>
+        <w:sz w:val="20"/>
+      </w:rPr>
+    </w:lvl>
+    <w:lvl w:ilvl="6" w:tentative="1">
+      <w:start w:val="1"/>
+      <w:numFmt w:val="bullet"/>
+      <w:lvlText w:val=""/>
+      <w:lvlJc w:val="left"/>
+      <w:pPr>
+        <w:tabs>
+          <w:tab w:val="num" w:pos="5040"/>
+        </w:tabs>
+        <w:ind w:left="5040" w:hanging="360"/>
+      </w:pPr>
+      <w:rPr>
+        <w:rFonts w:ascii="Symbol" w:hAnsi="Symbol" w:hint="default"/>
+        <w:sz w:val="20"/>
+      </w:rPr>
+    </w:lvl>
+    <w:lvl w:ilvl="7" w:tentative="1">
+      <w:start w:val="1"/>
+      <w:numFmt w:val="bullet"/>
+      <w:lvlText w:val=""/>
+      <w:lvlJc w:val="left"/>
+      <w:pPr>
+        <w:tabs>
+          <w:tab w:val="num" w:pos="5760"/>
+        </w:tabs>
+        <w:ind w:left="5760" w:hanging="360"/>
+      </w:pPr>
+      <w:rPr>
+        <w:rFonts w:ascii="Symbol" w:hAnsi="Symbol" w:hint="default"/>
+        <w:sz w:val="20"/>
+      </w:rPr>
+    </w:lvl>
+    <w:lvl w:ilvl="8" w:tentative="1">
+      <w:start w:val="1"/>
+      <w:numFmt w:val="bullet"/>
+      <w:lvlText w:val=""/>
+      <w:lvlJc w:val="left"/>
+      <w:pPr>
+        <w:tabs>
+          <w:tab w:val="num" w:pos="6480"/>
+        </w:tabs>
+        <w:ind w:left="6480" w:hanging="360"/>
+      </w:pPr>
+      <w:rPr>
+        <w:rFonts w:ascii="Symbol" w:hAnsi="Symbol" w:hint="default"/>
+        <w:sz w:val="20"/>
+      </w:rPr>
     </w:lvl>
   </w:abstractNum>
   <w:num w:numId="1" w16cid:durableId="218367552">
@@ -2747,6 +3373,12 @@
     <w:abstractNumId w:val="1"/>
   </w:num>
   <w:num w:numId="4" w16cid:durableId="106585898">
+    <w:abstractNumId w:val="4"/>
+  </w:num>
+  <w:num w:numId="5" w16cid:durableId="36667229">
+    <w:abstractNumId w:val="5"/>
+  </w:num>
+  <w:num w:numId="6" w16cid:durableId="2119526064">
     <w:abstractNumId w:val="3"/>
   </w:num>
 </w:numbering>

</xml_diff>